<commit_message>
Fill in YouTube Studio config section and finalize thumbnail decision in V2 (Atun) checklist
</commit_message>
<xml_diff>
--- a/etiqueta-real/atun/Atun_Prepublish_Checklist.docx
+++ b/etiqueta-real/atun/Atun_Prepublish_Checklist.docx
@@ -765,6 +765,51 @@
       </w:pPr>
       <w:r>
         <w:t xml:space="preserve">6. Configuración en YouTube Studio</w:t>
+      </w:r>
+    </w:p>
+    <w:p>
+      <w:r>
+        <w:t>☐ Categoría: Guías y estilo (o Educación) — coherente con el formato de análisis de producto.</w:t>
+      </w:r>
+    </w:p>
+    <w:p>
+      <w:r>
+        <w:t>☐ Idioma del video y del metadato: Español.</w:t>
+      </w:r>
+    </w:p>
+    <w:p>
+      <w:r>
+        <w:t>☐ Audiencia: No es contenido para niños ("No, no está hecho para niños").</w:t>
+      </w:r>
+    </w:p>
+    <w:p>
+      <w:r>
+        <w:t>☐ Visibilidad al publicar: Público, mismo horario que V1 (~18:00 hora España) para replicar el patrón de tráfico ya validado.</w:t>
+      </w:r>
+    </w:p>
+    <w:p>
+      <w:r>
+        <w:t>☐ Playlist: añadir a la playlist "Rankings de marcas" (crear si no existe) junto con V1 (Aceite) para favorecer el efecto catálogo/Sugeridos entre ambos vídeos.</w:t>
+      </w:r>
+    </w:p>
+    <w:p>
+      <w:r>
+        <w:t>☐ Pantalla final (end screen): tarjeta enlazando a V1 (Aceite) + suscripción — V1 ya está publicado y en pleno tirón, así que interlinkar en ambas direcciones ayuda a las dos.</w:t>
+      </w:r>
+    </w:p>
+    <w:p>
+      <w:r>
+        <w:t>☐ Tarjetas (cards): una tarjeta hacia V1 en el minuto donde se menciona el paralelismo de grupos propietarios (si el guion lo permite).</w:t>
+      </w:r>
+    </w:p>
+    <w:p>
+      <w:r>
+        <w:t>☐ Comentarios: mantener "Comentarios habilitados" con revisión, igual que V1 (no hubo backlog en V1 según el estado del canal).</w:t>
+      </w:r>
+    </w:p>
+    <w:p>
+      <w:r>
+        <w:t>☐ Miniatura final: subir la versión elegida en esta sesión (entorno de lonja/nave industrial, hielo, 7 latas reales: Calvo, Nostromo, Ortiz, Carrefour, Isabel, Robinson Crusoe, Hacendado) — descartada la variante con Consorcio por incluir una de las "mejores opciones" en el grupo de marcas a evitar.</w:t>
       </w:r>
     </w:p>
     <w:tbl>

</xml_diff>

<commit_message>
Rewrite V2 (Atun) description with vidIQ keywords woven naturally + real chapter timestamps
</commit_message>
<xml_diff>
--- a/etiqueta-real/atun/Atun_Prepublish_Checklist.docx
+++ b/etiqueta-real/atun/Atun_Prepublish_Checklist.docx
@@ -250,7 +250,16 @@
         <w:spacing w:after="120"/>
       </w:pPr>
       <w:r>
-        <w:t xml:space="preserve">En este vídeo abrimos 7 de las marcas de atún más vendidas del mundo hispanohablante — desde España hasta Chile, desde México hasta Ecuador — y te enseñamos quién fabrica de verdad cada una. Al final, 3 marcas que sí son exactamente lo que dicen ser.</w:t>
+        <w:t>Nadie tiene tiempo de hacer un análisis de conservas de pescado marca por marca antes de meter una lata al carro. Por eso este vídeo hace ese trabajo por ti: repasamos 7 de las marcas de atún en conserva más vendidas en España y Latinoamérica — Isabel, Calvo, Hacendado, Robinson Crusoe, Ortiz, Nostromo y Carrefour — y te explicamos qué atún comprar y cuáles son, directamente, marcas de atún a evitar.</w:t>
+        <w:br/>
+        <w:br/>
+        <w:t>Desde el peso escurrido real hasta quién fabrica de verdad cada marca detrás del nombre, esta comparativa de atún claro te enseña qué mirar antes de tu próxima compra — y por qué el atún en aceite de oliva no siempre es mejor opción que el atún al natural solo por el precio.</w:t>
+        <w:br/>
+        <w:br/>
+        <w:t>Aquí va lo importante: el atún caro no siempre es el más seguro, y la marca blanca no siempre es la peor. Lo que casi nadie mira es la estructura del grupo que hay detrás de la marca, y eso es justo lo que determina si tienes en tu despensa un atún sano y bien trazado, o una lata que promete más de lo que cumple.</w:t>
+        <w:br/>
+        <w:br/>
+        <w:t>También te enseñamos 3 marcas que sí ofrecen el mejor atún calidad precio de verdad, y unas reglas simples de comida real de supermercado para saber cómo elegir un buen atún sin dejarte guiar solo por el packaging.</w:t>
       </w:r>
     </w:p>
     <w:p>
@@ -332,6 +341,66 @@
       </w:pPr>
       <w:r>
         <w:t xml:space="preserve">Capítulos (timestamps aproximados, ajustar al montaje final):</w:t>
+      </w:r>
+    </w:p>
+    <w:p>
+      <w:r>
+        <w:t>00:00 - El problema real del atún en conserva</w:t>
+      </w:r>
+    </w:p>
+    <w:p>
+      <w:r>
+        <w:t>02:00 - Puesto 7: Hacendado (Mercadona)</w:t>
+      </w:r>
+    </w:p>
+    <w:p>
+      <w:r>
+        <w:t>05:00 - Puesto 6: Robinson Crusoe</w:t>
+      </w:r>
+    </w:p>
+    <w:p>
+      <w:r>
+        <w:t>07:30 - Puesto 5: Isabel</w:t>
+      </w:r>
+    </w:p>
+    <w:p>
+      <w:r>
+        <w:t>09:00 - Por qué merece la pena suscribirte</w:t>
+      </w:r>
+    </w:p>
+    <w:p>
+      <w:r>
+        <w:t>11:00 - Puesto 4: Carrefour</w:t>
+      </w:r>
+    </w:p>
+    <w:p>
+      <w:r>
+        <w:t>14:00 - Puesto 3: Conservas Ortiz</w:t>
+      </w:r>
+    </w:p>
+    <w:p>
+      <w:r>
+        <w:t>17:00 - Puesto 2: Nostromo</w:t>
+      </w:r>
+    </w:p>
+    <w:p>
+      <w:r>
+        <w:t>19:30 - Puesto 1: Calvo</w:t>
+      </w:r>
+    </w:p>
+    <w:p>
+      <w:r>
+        <w:t>22:00 - Las 3 marcas que sí cumplen</w:t>
+      </w:r>
+    </w:p>
+    <w:p>
+      <w:r>
+        <w:t>24:30 - El veredicto final y cómo comprar mejor</w:t>
+      </w:r>
+    </w:p>
+    <w:p>
+      <w:r>
+        <w:t>Aviso: Este vídeo tiene fines informativos y de análisis de consumo, basado en información pública y verificable (normativa UE, informes de la OCU e información corporativa de cada grupo). No sustituye un análisis de laboratorio oficial ni asesoría legal.</w:t>
       </w:r>
     </w:p>
     <w:tbl>
@@ -655,7 +724,7 @@
         <w:spacing w:after="120"/>
       </w:pPr>
       <w:r>
-        <w:t xml:space="preserve">atún en lata, marcas de atún, atún Isabel, atún Calvo, Hacendado atún, Robinson Crusoe atún, Conservas Ortiz, Nostromo atún, Carrefour marca blanca, Grupo Calvo, Bolton Group, Jealsa, Conservas Garavilla, mercurio en el atún, atún claro, OCU atún, etiquetado alimentario, marca blanca supermercado, conservas de pescado, mejor atún en lata</w:t>
+        <w:t>atún en lata, marcas de atún, atún Isabel, atún Calvo, Hacendado atún, Robinson Crusoe atún, Conservas Ortiz, Nostromo atún, Carrefour marca blanca, Grupo Calvo, Bolton Group, Jealsa, Conservas Garavilla, mercurio en el atún, atún claro, OCU atún, etiquetado alimentario, marca blanca supermercado, conservas de pescado, mejor atún en lata, atún en conserva calidad, comparativa atún claro, que atún comprar, atún marcas a evitar, análisis conservas pescado, etiqueta real atún, atún sano, mejor atún calidad precio, atún en aceite de oliva, comida real supermercado, cómo elegir un buen atún</w:t>
       </w:r>
     </w:p>
     <w:p>

</xml_diff>